<commit_message>
Updated study notes and key terms across 15 languages with extensive content revisions.
</commit_message>
<xml_diff>
--- a/arb/docx/004.content.docx
+++ b/arb/docx/004.content.docx
@@ -953,6 +953,71 @@
         <w:rPr>
           <w:lang w:val="ar_AE" w:bidi="ar_AE"/>
         </w:rPr>
+        <w:t>قصيدة أبجدية</w:t>
+      </w:r>
+      <w:r>
+        <w:rPr>
+          <w:lang w:val="ar_AE" w:bidi="ar_AE"/>
+        </w:rPr>
+      </w:r>
+    </w:p>
+    <w:p>
+      <w:pPr>
+        <w:bidi/>
+      </w:pPr>
+      <w:r>
+        <w:rPr>
+          <w:lang w:val="ar_AE" w:bidi="ar_AE"/>
+        </w:rPr>
+      </w:r>
+      <w:r>
+        <w:rPr>
+          <w:lang w:val="ar_AE" w:bidi="ar_AE"/>
+        </w:rPr>
+        <w:t>قصيدة يبدأ كل سطر أو مقطع فيها بحرف مختلف من الحروف الأبجدية. يبدأ السطر الأول أو المقطع الأول بالحرف الأول من الأبجدية. ويبدأ السطر أو المقطع الثاني بالحرف الثاني. يستمر هذا النمط حتى نهاية الحروف الأبجدية. كانت القصائد الأبجدية شائعة في اللغة العبرية. (</w:t>
+      </w:r>
+      <w:r>
+        <w:rPr>
+          <w:lang w:val="ar_AE" w:bidi="ar_AE"/>
+        </w:rPr>
+        <w:t>قصيدة</w:t>
+      </w:r>
+      <w:r>
+        <w:rPr>
+          <w:lang w:val="ar_AE" w:bidi="ar_AE"/>
+        </w:rPr>
+        <w:t>)</w:t>
+      </w:r>
+      <w:r>
+        <w:rPr>
+          <w:lang w:val="ar_AE" w:bidi="ar_AE"/>
+        </w:rPr>
+      </w:r>
+      <w:r>
+        <w:rPr>
+          <w:lang w:val="ar_AE" w:bidi="ar_AE"/>
+        </w:rPr>
+      </w:r>
+    </w:p>
+    <w:p>
+      <w:pPr>
+        <w:bidi/>
+      </w:pPr>
+      <w:r>
+        <w:rPr>
+          <w:lang w:val="ar_AE" w:bidi="ar_AE"/>
+        </w:rPr>
+      </w:r>
+    </w:p>
+    <w:p>
+      <w:pPr>
+        <w:pStyle w:val="Heading2"/>
+        <w:bidi/>
+      </w:pPr>
+      <w:r>
+        <w:rPr>
+          <w:lang w:val="ar_AE" w:bidi="ar_AE"/>
+        </w:rPr>
         <w:t>قصيدة (شعر)</w:t>
       </w:r>
       <w:r>
@@ -975,71 +1040,6 @@
           <w:lang w:val="ar_AE" w:bidi="ar_AE"/>
         </w:rPr>
         <w:t>إنها طريقة للتحدث أو الكتابة يمكن أن تكون مثل الغناء. وغالبًا لا تصف القصائد الأشياء بشكل مباشر. بل إنها ترسم صورًا وإشارات بالكلمات. وهي بدورها تساعد الناس على فهم ما يقوله المتحدث أو الكاتب. تصف القصائد شيئًا من خلال شرح كيف يشبه شيئًا آخر. يشمل الكتاب المقدس العديد من القصائد المكتوبة باللغة العبرية. العديد من هذه القصائد كانت تُقال وتُكتب سطرين في كل مرة. كان السطر الأول يشارك فكرة ما. ثم يكمل السطر الثاني تلك الفكرة. وقد كان يفعل ذلك من خلال مشاركة نفس الفكرة مرة أخرى ولكن بطريقة جديدة أو مختلفة. وكان ذلك يساعد الناس على فهم وتذكر ما يريد المتحدث أو الكاتب قوله.</w:t>
-      </w:r>
-      <w:r>
-        <w:rPr>
-          <w:lang w:val="ar_AE" w:bidi="ar_AE"/>
-        </w:rPr>
-      </w:r>
-      <w:r>
-        <w:rPr>
-          <w:lang w:val="ar_AE" w:bidi="ar_AE"/>
-        </w:rPr>
-      </w:r>
-    </w:p>
-    <w:p>
-      <w:pPr>
-        <w:bidi/>
-      </w:pPr>
-      <w:r>
-        <w:rPr>
-          <w:lang w:val="ar_AE" w:bidi="ar_AE"/>
-        </w:rPr>
-      </w:r>
-    </w:p>
-    <w:p>
-      <w:pPr>
-        <w:pStyle w:val="Heading2"/>
-        <w:bidi/>
-      </w:pPr>
-      <w:r>
-        <w:rPr>
-          <w:lang w:val="ar_AE" w:bidi="ar_AE"/>
-        </w:rPr>
-        <w:t>قصيدة أبجدية</w:t>
-      </w:r>
-      <w:r>
-        <w:rPr>
-          <w:lang w:val="ar_AE" w:bidi="ar_AE"/>
-        </w:rPr>
-      </w:r>
-    </w:p>
-    <w:p>
-      <w:pPr>
-        <w:bidi/>
-      </w:pPr>
-      <w:r>
-        <w:rPr>
-          <w:lang w:val="ar_AE" w:bidi="ar_AE"/>
-        </w:rPr>
-      </w:r>
-      <w:r>
-        <w:rPr>
-          <w:lang w:val="ar_AE" w:bidi="ar_AE"/>
-        </w:rPr>
-        <w:t>قصيدة يبدأ كل سطر أو مقطع فيها بحرف مختلف من الحروف الأبجدية. يبدأ السطر الأول أو المقطع الأول بالحرف الأول من الأبجدية. ويبدأ السطر أو المقطع الثاني بالحرف الثاني. يستمر هذا النمط حتى نهاية الحروف الأبجدية. كانت القصائد الأبجدية شائعة في اللغة العبرية. (</w:t>
-      </w:r>
-      <w:r>
-        <w:rPr>
-          <w:lang w:val="ar_AE" w:bidi="ar_AE"/>
-        </w:rPr>
-        <w:t>قصيدة</w:t>
-      </w:r>
-      <w:r>
-        <w:rPr>
-          <w:lang w:val="ar_AE" w:bidi="ar_AE"/>
-        </w:rPr>
-        <w:t>)</w:t>
       </w:r>
       <w:r>
         <w:rPr>

</xml_diff>